<commit_message>
feat: Phase C2 EX-005 Retinex 光照交换（72.5 分全场第 2，C2ST 0.744 全场最佳，复制率归零）+ REPORT_ML 第 7 章更新
- retinex_gen.py：v0 亮度崩塌公式修复（log 域插值 R_A·L_A^(1-α)·L_B^α）+ 方案3 近复制过滤（NN-SSIM>0.85 重采样，复制率 1.7%→0）
- 06-Records.md：EX-005 六段式记录 + 登记表同步 11 模型现版 min-max 分（平移如实标注）
- _build_report_ml.py：第 7 章【待实验】→ EX-004/EX-005 六段式完成结果，总分动态取分（8 表 6 图 9 章）
- 文档：CONTINUE_GUIDE v21→v22；2026-08-18 样本量新规（60 张）已同步全部执行类文档
- eval_data：retinex 评估 JSON 入库，11 模型评分/图表更新

Co-Authored-By: Claude <noreply@anthropic.com>
</commit_message>
<xml_diff>
--- a/research-report/REPORT_ML.docx
+++ b/research-report/REPORT_ML.docx
@@ -29,7 +29,7 @@
         <w:rPr>
           <w:sz w:val="20"/>
         </w:rPr>
-        <w:t>2026-08-03 ｜ 数据：330 张 KW-IV 重度眼底彩照 ｜ 方法：PCA / GMM / 补丁拼接（基线）+ 组合管线（后续）</w:t>
+        <w:t>2026-08-26 ｜ 数据：330 张 KW-IV 重度眼底彩照 ｜ 方法：PCA / GMM / 补丁拼接（基线）+ 泊松病变重排 / Retinex 光照交换（组合）</w:t>
       </w:r>
     </w:p>
     <w:p>
@@ -262,7 +262,7 @@
               <w:rPr>
                 <w:sz w:val="18"/>
               </w:rPr>
-              <w:t>300 张/方法</w:t>
+              <w:t>基线 300 张 / 组合 60 张</w:t>
             </w:r>
           </w:p>
         </w:tc>
@@ -275,7 +275,7 @@
               <w:rPr>
                 <w:sz w:val="18"/>
               </w:rPr>
-              <w:t>seed=42，sample_0000~0299</w:t>
+              <w:t>旧基线 300 张；组合按 2026-08-18 样本量新规取 60 张</w:t>
             </w:r>
           </w:p>
         </w:tc>
@@ -299,7 +299,7 @@
     </w:p>
     <w:p>
       <w:r>
-        <w:t>Phase A/B 已经为 6 个深度方法建好了一套评估体系（通用层 + 专用层 + 六维门控综合评分）。传统 ML 方法复用同一套，才能和深度方法在同一个标尺上横向对比——这正是"补丁拼接 42.1 分 vs FiLM 扩散 70.9 分"这类结论的前提。否则各说各话，报告没有说服力。</w:t>
+        <w:t>Phase A/B 已经为 6 个深度方法建好了一套评估体系（通用层 + 专用层 + 六维门控综合评分）。传统 ML 方法复用同一套，才能和深度方法在同一个标尺上横向对比——这正是"补丁拼接 31.0 分 vs FiLM 扩散 45.2 分"这类结论的前提。否则各说各话，报告没有说服力。</w:t>
       </w:r>
     </w:p>
     <w:p>
@@ -685,7 +685,7 @@
     </w:p>
     <w:p>
       <w:r>
-        <w:t>本报告早期按"传统 ML 无条件图跳过 C2ST"执行，结果补丁拼接打出 62.9 分的伪高分——逼近深度最佳 70.9。排查发现根因是评分口径不均：深度模型的 D2 维度含 C2ST（权重 0.40），而 ML 基线没有，导致 D2 在不同指标集上对比。补跑 C2ST 后补丁回落到 42.1，GMM 升到 40.2、PCA 升到 20.0，全部同口径。这条教训已写进执行计划：C2ST 必跑，不能跳过。</w:t>
+        <w:t>本报告早期按"传统 ML 无条件图跳过 C2ST"执行，结果补丁拼接打出 62.9 分的伪高分——逼近当年深度最佳 70.9（min-max 相对分，模型库后续扩大已整体平移，现版各分数见第 8 章）。排查发现根因是评分口径不均：深度模型的 D2 维度含 C2ST（权重 0.40），而 ML 基线没有，导致 D2 在不同指标集上对比。补跑 C2ST 后补丁大幅回落、GMM/PCA 同步重估，全部同口径。这条教训已写进执行计划：C2ST 必跑，不能跳过。</w:t>
       </w:r>
     </w:p>
     <w:p>
@@ -1110,7 +1110,7 @@
     </w:p>
     <w:p>
       <w:r>
-        <w:t>总分 20.0 分，FID 297.1（全组最差，深度最佳 178.8）。1-NN=1.000（完美可分），IS=1.58（多样性几乎为零）。病灶保留率：出血 1.57（偏多）、渗出 0.56（偏少）——连病灶比例都没对齐。记忆检测通过（接近复制占比 0）。人眼评分【待人工评估】。</w:t>
+        <w:t>总分 11.9 分（完成时 20.0；min-max 相对分随模型库扩大平移，下同），FID 297.1（全组最差，深度最佳 178.8）。1-NN=1.000（完美可分），IS=1.58（多样性几乎为零）。病灶保留率：出血 1.57（偏多）、渗出 0.56（偏少）——连病灶比例都没对齐。记忆检测通过（接近复制占比 0）。人眼评分【待人工评估】。</w:t>
       </w:r>
     </w:p>
     <w:tbl>
@@ -1197,7 +1197,7 @@
               <w:rPr>
                 <w:sz w:val="18"/>
               </w:rPr>
-              <w:t>0.81</w:t>
+              <w:t>0.76</w:t>
             </w:r>
           </w:p>
         </w:tc>
@@ -1210,7 +1210,7 @@
               <w:rPr>
                 <w:sz w:val="18"/>
               </w:rPr>
-              <w:t>0.71</w:t>
+              <w:t>0.68</w:t>
             </w:r>
           </w:p>
         </w:tc>
@@ -1238,7 +1238,7 @@
               <w:rPr>
                 <w:sz w:val="18"/>
               </w:rPr>
-              <w:t>0.87</w:t>
+              <w:t>0.45</w:t>
             </w:r>
           </w:p>
         </w:tc>
@@ -1251,7 +1251,7 @@
               <w:rPr>
                 <w:sz w:val="18"/>
               </w:rPr>
-              <w:t>0.23</w:t>
+              <w:t>0.08</w:t>
             </w:r>
           </w:p>
         </w:tc>
@@ -1279,7 +1279,7 @@
               <w:rPr>
                 <w:sz w:val="18"/>
               </w:rPr>
-              <w:t>0.83</w:t>
+              <w:t>0.76</w:t>
             </w:r>
           </w:p>
         </w:tc>
@@ -1292,7 +1292,7 @@
               <w:rPr>
                 <w:sz w:val="18"/>
               </w:rPr>
-              <w:t>0.30</w:t>
+              <w:t>0.29</w:t>
             </w:r>
           </w:p>
         </w:tc>
@@ -1320,7 +1320,7 @@
               <w:rPr>
                 <w:sz w:val="18"/>
               </w:rPr>
-              <w:t>0.33</w:t>
+              <w:t>0.32</w:t>
             </w:r>
           </w:p>
         </w:tc>
@@ -1333,7 +1333,7 @@
               <w:rPr>
                 <w:sz w:val="18"/>
               </w:rPr>
-              <w:t>0.37</w:t>
+              <w:t>0.32</w:t>
             </w:r>
           </w:p>
         </w:tc>
@@ -1361,7 +1361,7 @@
               <w:rPr>
                 <w:sz w:val="18"/>
               </w:rPr>
-              <w:t>0.55</w:t>
+              <w:t>0.52</w:t>
             </w:r>
           </w:p>
         </w:tc>
@@ -1374,7 +1374,7 @@
               <w:rPr>
                 <w:sz w:val="18"/>
               </w:rPr>
-              <w:t>0.98</w:t>
+              <w:t>0.94</w:t>
             </w:r>
           </w:p>
         </w:tc>
@@ -1402,7 +1402,7 @@
               <w:rPr>
                 <w:sz w:val="18"/>
               </w:rPr>
-              <w:t>0.68</w:t>
+              <w:t>0.73</w:t>
             </w:r>
           </w:p>
         </w:tc>
@@ -1415,7 +1415,7 @@
               <w:rPr>
                 <w:sz w:val="18"/>
               </w:rPr>
-              <w:t>0.10</w:t>
+              <w:t>0.25</w:t>
             </w:r>
           </w:p>
         </w:tc>
@@ -1443,7 +1443,7 @@
               <w:rPr>
                 <w:sz w:val="18"/>
               </w:rPr>
-              <w:t>70.8</w:t>
+              <w:t>45.2</w:t>
             </w:r>
           </w:p>
         </w:tc>
@@ -1456,7 +1456,7 @@
               <w:rPr>
                 <w:sz w:val="18"/>
               </w:rPr>
-              <w:t>20.0</w:t>
+              <w:t>11.9</w:t>
             </w:r>
           </w:p>
         </w:tc>
@@ -1650,7 +1650,7 @@
     </w:p>
     <w:p>
       <w:r>
-        <w:t>总分 40.2 分，FID 233.8，1-NN=1.000。比 PCA 好：能出大致形状和轮廓，病灶保留率也更接近 1（出血 1.43、渗出 0.71）。但病灶仍模糊，放大即露馅。记忆检测通过。人眼评分【待人工评估】。</w:t>
+        <w:t>总分 22.6 分（完成时 40.2），FID 233.8，1-NN=1.000。比 PCA 好：能出大致形状和轮廓，病灶保留率也更接近 1（出血 1.43、渗出 0.71）。但病灶仍模糊，放大即露馅。记忆检测通过。人眼评分【待人工评估】。</w:t>
       </w:r>
     </w:p>
     <w:tbl>
@@ -1737,7 +1737,7 @@
               <w:rPr>
                 <w:sz w:val="18"/>
               </w:rPr>
-              <w:t>0.81</w:t>
+              <w:t>0.76</w:t>
             </w:r>
           </w:p>
         </w:tc>
@@ -1750,7 +1750,7 @@
               <w:rPr>
                 <w:sz w:val="18"/>
               </w:rPr>
-              <w:t>0.80</w:t>
+              <w:t>0.76</w:t>
             </w:r>
           </w:p>
         </w:tc>
@@ -1778,7 +1778,7 @@
               <w:rPr>
                 <w:sz w:val="18"/>
               </w:rPr>
-              <w:t>0.87</w:t>
+              <w:t>0.45</w:t>
             </w:r>
           </w:p>
         </w:tc>
@@ -1791,7 +1791,7 @@
               <w:rPr>
                 <w:sz w:val="18"/>
               </w:rPr>
-              <w:t>0.52</w:t>
+              <w:t>0.25</w:t>
             </w:r>
           </w:p>
         </w:tc>
@@ -1819,7 +1819,7 @@
               <w:rPr>
                 <w:sz w:val="18"/>
               </w:rPr>
-              <w:t>0.83</w:t>
+              <w:t>0.76</w:t>
             </w:r>
           </w:p>
         </w:tc>
@@ -1832,7 +1832,7 @@
               <w:rPr>
                 <w:sz w:val="18"/>
               </w:rPr>
-              <w:t>0.32</w:t>
+              <w:t>0.31</w:t>
             </w:r>
           </w:p>
         </w:tc>
@@ -1860,7 +1860,7 @@
               <w:rPr>
                 <w:sz w:val="18"/>
               </w:rPr>
-              <w:t>0.33</w:t>
+              <w:t>0.32</w:t>
             </w:r>
           </w:p>
         </w:tc>
@@ -1873,7 +1873,7 @@
               <w:rPr>
                 <w:sz w:val="18"/>
               </w:rPr>
-              <w:t>0.74</w:t>
+              <w:t>0.64</w:t>
             </w:r>
           </w:p>
         </w:tc>
@@ -1901,7 +1901,7 @@
               <w:rPr>
                 <w:sz w:val="18"/>
               </w:rPr>
-              <w:t>0.55</w:t>
+              <w:t>0.52</w:t>
             </w:r>
           </w:p>
         </w:tc>
@@ -1914,7 +1914,7 @@
               <w:rPr>
                 <w:sz w:val="18"/>
               </w:rPr>
-              <w:t>1.00</w:t>
+              <w:t>0.95</w:t>
             </w:r>
           </w:p>
         </w:tc>
@@ -1942,7 +1942,7 @@
               <w:rPr>
                 <w:sz w:val="18"/>
               </w:rPr>
-              <w:t>0.68</w:t>
+              <w:t>0.73</w:t>
             </w:r>
           </w:p>
         </w:tc>
@@ -1955,7 +1955,7 @@
               <w:rPr>
                 <w:sz w:val="18"/>
               </w:rPr>
-              <w:t>0.00</w:t>
+              <w:t>0.16</w:t>
             </w:r>
           </w:p>
         </w:tc>
@@ -1983,7 +1983,7 @@
               <w:rPr>
                 <w:sz w:val="18"/>
               </w:rPr>
-              <w:t>70.8</w:t>
+              <w:t>45.2</w:t>
             </w:r>
           </w:p>
         </w:tc>
@@ -1996,7 +1996,7 @@
               <w:rPr>
                 <w:sz w:val="18"/>
               </w:rPr>
-              <w:t>40.2</w:t>
+              <w:t>22.6</w:t>
             </w:r>
           </w:p>
         </w:tc>
@@ -2179,7 +2179,7 @@
     </w:p>
     <w:p>
       <w:r>
-        <w:t>总分 42.1 分，FID 159.2（三个 ML 里最低，甚至比部分深度模型还低），1-NN=0.995。病灶保留率最接近 1（出血 0.94、渗出 1.16），血管 Wasserstein 最小——因为像素本来就是真的。C2ST=1.000：真实像素拼接被小 CNN 一眼识破。记忆检测通过（接近复制占比 0）。人眼评分【待人工评估】。</w:t>
+        <w:t>总分 31.0 分（完成时 42.1），FID 159.2（三个 ML 里最低，甚至比部分深度模型还低），1-NN=0.995。病灶保留率最接近 1（出血 0.94、渗出 1.16），血管 Wasserstein 最小——因为像素本来就是真的。C2ST=1.000：真实像素拼接被小 CNN 一眼识破。记忆检测通过（接近复制占比 0）。人眼评分【待人工评估】。</w:t>
       </w:r>
     </w:p>
     <w:tbl>
@@ -2266,7 +2266,7 @@
               <w:rPr>
                 <w:sz w:val="18"/>
               </w:rPr>
-              <w:t>0.81</w:t>
+              <w:t>0.76</w:t>
             </w:r>
           </w:p>
         </w:tc>
@@ -2279,7 +2279,7 @@
               <w:rPr>
                 <w:sz w:val="18"/>
               </w:rPr>
-              <w:t>0.96</w:t>
+              <w:t>0.91</w:t>
             </w:r>
           </w:p>
         </w:tc>
@@ -2307,7 +2307,48 @@
               <w:rPr>
                 <w:sz w:val="18"/>
               </w:rPr>
-              <w:t>0.87</w:t>
+              <w:t>0.45</w:t>
+            </w:r>
+          </w:p>
+        </w:tc>
+        <w:tc>
+          <w:tcPr>
+            <w:tcW w:type="dxa" w:w="3000"/>
+          </w:tcPr>
+          <w:p>
+            <w:r>
+              <w:rPr>
+                <w:sz w:val="18"/>
+              </w:rPr>
+              <w:t>0.29</w:t>
+            </w:r>
+          </w:p>
+        </w:tc>
+      </w:tr>
+      <w:tr>
+        <w:tc>
+          <w:tcPr>
+            <w:tcW w:type="dxa" w:w="4200"/>
+          </w:tcPr>
+          <w:p>
+            <w:r>
+              <w:rPr>
+                <w:sz w:val="18"/>
+              </w:rPr>
+              <w:t>D3 多样性/质量</w:t>
+            </w:r>
+          </w:p>
+        </w:tc>
+        <w:tc>
+          <w:tcPr>
+            <w:tcW w:type="dxa" w:w="3000"/>
+          </w:tcPr>
+          <w:p>
+            <w:r>
+              <w:rPr>
+                <w:sz w:val="18"/>
+              </w:rPr>
+              <w:t>0.76</w:t>
             </w:r>
           </w:p>
         </w:tc>
@@ -2335,47 +2376,6 @@
               <w:rPr>
                 <w:sz w:val="18"/>
               </w:rPr>
-              <w:t>D3 多样性/质量</w:t>
-            </w:r>
-          </w:p>
-        </w:tc>
-        <w:tc>
-          <w:tcPr>
-            <w:tcW w:type="dxa" w:w="3000"/>
-          </w:tcPr>
-          <w:p>
-            <w:r>
-              <w:rPr>
-                <w:sz w:val="18"/>
-              </w:rPr>
-              <w:t>0.83</w:t>
-            </w:r>
-          </w:p>
-        </w:tc>
-        <w:tc>
-          <w:tcPr>
-            <w:tcW w:type="dxa" w:w="3000"/>
-          </w:tcPr>
-          <w:p>
-            <w:r>
-              <w:rPr>
-                <w:sz w:val="18"/>
-              </w:rPr>
-              <w:t>0.45</w:t>
-            </w:r>
-          </w:p>
-        </w:tc>
-      </w:tr>
-      <w:tr>
-        <w:tc>
-          <w:tcPr>
-            <w:tcW w:type="dxa" w:w="4200"/>
-          </w:tcPr>
-          <w:p>
-            <w:r>
-              <w:rPr>
-                <w:sz w:val="18"/>
-              </w:rPr>
               <w:t>D4 血管结构</w:t>
             </w:r>
           </w:p>
@@ -2389,7 +2389,7 @@
               <w:rPr>
                 <w:sz w:val="18"/>
               </w:rPr>
-              <w:t>0.33</w:t>
+              <w:t>0.32</w:t>
             </w:r>
           </w:p>
         </w:tc>
@@ -2402,7 +2402,7 @@
               <w:rPr>
                 <w:sz w:val="18"/>
               </w:rPr>
-              <w:t>1.00</w:t>
+              <w:t>0.86</w:t>
             </w:r>
           </w:p>
         </w:tc>
@@ -2430,7 +2430,7 @@
               <w:rPr>
                 <w:sz w:val="18"/>
               </w:rPr>
-              <w:t>0.55</w:t>
+              <w:t>0.52</w:t>
             </w:r>
           </w:p>
         </w:tc>
@@ -2443,7 +2443,7 @@
               <w:rPr>
                 <w:sz w:val="18"/>
               </w:rPr>
-              <w:t>0.80</w:t>
+              <w:t>0.76</w:t>
             </w:r>
           </w:p>
         </w:tc>
@@ -2471,7 +2471,7 @@
               <w:rPr>
                 <w:sz w:val="18"/>
               </w:rPr>
-              <w:t>0.68</w:t>
+              <w:t>0.73</w:t>
             </w:r>
           </w:p>
         </w:tc>
@@ -2484,7 +2484,7 @@
               <w:rPr>
                 <w:sz w:val="18"/>
               </w:rPr>
-              <w:t>0.28</w:t>
+              <w:t>0.40</w:t>
             </w:r>
           </w:p>
         </w:tc>
@@ -2512,7 +2512,7 @@
               <w:rPr>
                 <w:sz w:val="18"/>
               </w:rPr>
-              <w:t>70.8</w:t>
+              <w:t>45.2</w:t>
             </w:r>
           </w:p>
         </w:tc>
@@ -2525,7 +2525,7 @@
               <w:rPr>
                 <w:sz w:val="18"/>
               </w:rPr>
-              <w:t>42.1</w:t>
+              <w:t>31.0</w:t>
             </w:r>
           </w:p>
         </w:tc>
@@ -2636,12 +2636,12 @@
         <w:pStyle w:val="Heading1"/>
       </w:pPr>
       <w:r>
-        <w:t>7. 高价值组合：后续方向【待实验】</w:t>
+        <w:t>7. 高价值组合：泊松病变重排 + Retinex 光照交换（已实现）</w:t>
       </w:r>
     </w:p>
     <w:p>
       <w:r>
-        <w:t>三个基线的结论指向同一个方向：单一传统 ML 不行，但"组合"可行。文献里最有支撑的两条组合（均有眼底专版验证）如下，本报告规划为下一阶段实验，尚未跑，不虚写结果。</w:t>
+        <w:t>三个基线的结论指向同一个方向：单一传统 ML 不行，但"组合"可行。文献里最有支撑的两条组合（均有眼底专版验证）已按六段式跑完：泊松病变重排（EX-004）与 Retinex 光照交换（EX-005）。它们都产出了三个基线做不到的东西——保留真实纹理的同时引入新变化，真正"相似但不相同"。</w:t>
       </w:r>
     </w:p>
     <w:p>
@@ -2649,12 +2649,15 @@
         <w:pStyle w:val="Heading2"/>
       </w:pPr>
       <w:r>
-        <w:t>7.1 泊松病变重排（文献基础：强）</w:t>
+        <w:t>7.1 泊松病变重排（EX-004，80.8 分）</w:t>
       </w:r>
     </w:p>
     <w:p>
+      <w:pPr>
+        <w:pStyle w:val="Heading3"/>
+      </w:pPr>
       <w:r>
-        <w:t>做法：330 张全是重度 DR = 一座病变模板库。从图 A 抠一簇渗出、图 B 抠一块出血，用泊松编辑无缝贴到图 D 上，产出"新病变组合"的严重 DR 图。</w:t>
+        <w:t>7.1.1 是什么</w:t>
       </w:r>
     </w:p>
     <w:p>
@@ -2662,10 +2665,500 @@
         <w:rPr>
           <w:b/>
         </w:rPr>
-        <w:t>机制：</w:t>
+        <w:t>它：</w:t>
       </w:r>
       <w:r>
-        <w:t>为什么有用：泊松编辑只保留插入区域的梯度、用宿主图边界条件求解，所以贴上去的病灶无缝融合、不破坏宿主图。它生成的是经典增广永远做不到的东西——新的病灶组合。（Yu 2021 BOE：DR 筛查优于过采样/裁剪/旋转）</w:t>
+        <w:t>330 张全是重度 DR = 一座病变模板库。从图 A 抠一簇渗出、图 B 抠一块出血，用泊松编辑（cv2.seamlessClone NORMAL_CLONE）无缝贴到宿主图 D 上，再加全局旋转/色彩微变换，产出"新病变组合"的严重 DR 图。它不需要知道"哪块是病灶"——随机椭圆贴片簇（r60-150px @512）即可搬运病灶样内容。</w:t>
+      </w:r>
+    </w:p>
+    <w:p>
+      <w:pPr>
+        <w:pStyle w:val="Heading3"/>
+      </w:pPr>
+      <w:r>
+        <w:t>7.1.2 怎么做（略写）</w:t>
+      </w:r>
+    </w:p>
+    <w:p>
+      <w:pPr>
+        <w:ind w:left="432"/>
+      </w:pPr>
+      <w:r>
+        <w:rPr>
+          <w:rFonts w:ascii="Consolas" w:hAnsi="Consolas" w:eastAsia="微软雅黑"/>
+          <w:sz w:val="18"/>
+        </w:rPr>
+        <w:t>python scripts/poisson_gen.py --num_images 300 --seed 42 --max_patches 10 --patch_radius 100 --rot 15 --color_jit 0.18</w:t>
+      </w:r>
+    </w:p>
+    <w:p>
+      <w:pPr>
+        <w:pStyle w:val="Heading3"/>
+      </w:pPr>
+      <w:r>
+        <w:t>7.1.3 为什么有用</w:t>
+      </w:r>
+    </w:p>
+    <w:p>
+      <w:r>
+        <w:t>泊松编辑只保留插入区域的梯度、用宿主图边界条件求解，贴上去的病灶无缝融合、不破坏宿主图。它生成的是经典增广永远做不到的东西——新的病灶组合。（Yu 2021 BOE：DR 筛查优于过采样/裁剪/旋转）</w:t>
+      </w:r>
+    </w:p>
+    <w:p>
+      <w:pPr>
+        <w:pStyle w:val="Heading3"/>
+      </w:pPr>
+      <w:r>
+        <w:t>7.1.4 结果</w:t>
+      </w:r>
+    </w:p>
+    <w:p>
+      <w:r>
+        <w:t>总分 80.8（完成时 87.5；min-max 相对分随模型库扩大平移，下同），全场第 1。六维 D1 0.97 / D2 0.87 / D3 0.91 / D4 1.00 / D5 1.00 / D6 0.00。复制率 0.3%。FID 58.1（深度最佳 178.8）｜ C2ST 0.804（全场第 2 低）｜ BRISQUE 3.60≈真实 3.69 ｜ 病灶保留 出血 1.10/渗出 0.97 ｜ 血管 0.070 vs 真实 0.077。人眼评分：用户确认"几乎看不出来是生成的"。</w:t>
+      </w:r>
+    </w:p>
+    <w:tbl>
+      <w:tblPr>
+        <w:tblStyle w:val="TableGrid"/>
+        <w:tblW w:type="auto" w:w="0"/>
+        <w:tblLayout w:type="fixed"/>
+        <w:tblLook w:firstColumn="1" w:firstRow="1" w:lastColumn="0" w:lastRow="0" w:noHBand="0" w:noVBand="1" w:val="04A0"/>
+        <w:tblW w:w="10200" w:type="dxa"/>
+        <w:tblLayout w:type="fixed"/>
+      </w:tblPr>
+      <w:tblGrid>
+        <w:gridCol w:w="4200"/>
+        <w:gridCol w:w="3000"/>
+        <w:gridCol w:w="3000"/>
+      </w:tblGrid>
+      <w:tr>
+        <w:tc>
+          <w:tcPr>
+            <w:tcW w:type="dxa" w:w="2880"/>
+            <w:tcW w:w="4200" w:type="dxa"/>
+          </w:tcPr>
+          <w:p>
+            <w:r>
+              <w:rPr>
+                <w:b/>
+                <w:sz w:val="18"/>
+              </w:rPr>
+              <w:t>评分维度</w:t>
+            </w:r>
+          </w:p>
+        </w:tc>
+        <w:tc>
+          <w:tcPr>
+            <w:tcW w:type="dxa" w:w="2880"/>
+            <w:tcW w:w="3000" w:type="dxa"/>
+          </w:tcPr>
+          <w:p>
+            <w:r>
+              <w:rPr>
+                <w:b/>
+                <w:sz w:val="18"/>
+              </w:rPr>
+              <w:t>FiLM+LPIPS(深度最佳)</w:t>
+            </w:r>
+          </w:p>
+        </w:tc>
+        <w:tc>
+          <w:tcPr>
+            <w:tcW w:type="dxa" w:w="2880"/>
+            <w:tcW w:w="3000" w:type="dxa"/>
+          </w:tcPr>
+          <w:p>
+            <w:r>
+              <w:rPr>
+                <w:b/>
+                <w:sz w:val="18"/>
+              </w:rPr>
+              <w:t>泊松病变重排(EX-004)</w:t>
+            </w:r>
+          </w:p>
+        </w:tc>
+      </w:tr>
+      <w:tr>
+        <w:tc>
+          <w:tcPr>
+            <w:tcW w:type="dxa" w:w="4200"/>
+          </w:tcPr>
+          <w:p>
+            <w:r>
+              <w:rPr>
+                <w:sz w:val="18"/>
+              </w:rPr>
+              <w:t>D1 病灶保留</w:t>
+            </w:r>
+          </w:p>
+        </w:tc>
+        <w:tc>
+          <w:tcPr>
+            <w:tcW w:type="dxa" w:w="3000"/>
+          </w:tcPr>
+          <w:p>
+            <w:r>
+              <w:rPr>
+                <w:sz w:val="18"/>
+              </w:rPr>
+              <w:t>0.76</w:t>
+            </w:r>
+          </w:p>
+        </w:tc>
+        <w:tc>
+          <w:tcPr>
+            <w:tcW w:type="dxa" w:w="3000"/>
+          </w:tcPr>
+          <w:p>
+            <w:r>
+              <w:rPr>
+                <w:sz w:val="18"/>
+              </w:rPr>
+              <w:t>0.97</w:t>
+            </w:r>
+          </w:p>
+        </w:tc>
+      </w:tr>
+      <w:tr>
+        <w:tc>
+          <w:tcPr>
+            <w:tcW w:type="dxa" w:w="4200"/>
+          </w:tcPr>
+          <w:p>
+            <w:r>
+              <w:rPr>
+                <w:sz w:val="18"/>
+              </w:rPr>
+              <w:t>D2 抗识破+分布</w:t>
+            </w:r>
+          </w:p>
+        </w:tc>
+        <w:tc>
+          <w:tcPr>
+            <w:tcW w:type="dxa" w:w="3000"/>
+          </w:tcPr>
+          <w:p>
+            <w:r>
+              <w:rPr>
+                <w:sz w:val="18"/>
+              </w:rPr>
+              <w:t>0.45</w:t>
+            </w:r>
+          </w:p>
+        </w:tc>
+        <w:tc>
+          <w:tcPr>
+            <w:tcW w:type="dxa" w:w="3000"/>
+          </w:tcPr>
+          <w:p>
+            <w:r>
+              <w:rPr>
+                <w:sz w:val="18"/>
+              </w:rPr>
+              <w:t>0.87</w:t>
+            </w:r>
+          </w:p>
+        </w:tc>
+      </w:tr>
+      <w:tr>
+        <w:tc>
+          <w:tcPr>
+            <w:tcW w:type="dxa" w:w="4200"/>
+          </w:tcPr>
+          <w:p>
+            <w:r>
+              <w:rPr>
+                <w:sz w:val="18"/>
+              </w:rPr>
+              <w:t>D3 多样性/质量</w:t>
+            </w:r>
+          </w:p>
+        </w:tc>
+        <w:tc>
+          <w:tcPr>
+            <w:tcW w:type="dxa" w:w="3000"/>
+          </w:tcPr>
+          <w:p>
+            <w:r>
+              <w:rPr>
+                <w:sz w:val="18"/>
+              </w:rPr>
+              <w:t>0.76</w:t>
+            </w:r>
+          </w:p>
+        </w:tc>
+        <w:tc>
+          <w:tcPr>
+            <w:tcW w:type="dxa" w:w="3000"/>
+          </w:tcPr>
+          <w:p>
+            <w:r>
+              <w:rPr>
+                <w:sz w:val="18"/>
+              </w:rPr>
+              <w:t>0.91</w:t>
+            </w:r>
+          </w:p>
+        </w:tc>
+      </w:tr>
+      <w:tr>
+        <w:tc>
+          <w:tcPr>
+            <w:tcW w:type="dxa" w:w="4200"/>
+          </w:tcPr>
+          <w:p>
+            <w:r>
+              <w:rPr>
+                <w:sz w:val="18"/>
+              </w:rPr>
+              <w:t>D4 血管结构</w:t>
+            </w:r>
+          </w:p>
+        </w:tc>
+        <w:tc>
+          <w:tcPr>
+            <w:tcW w:type="dxa" w:w="3000"/>
+          </w:tcPr>
+          <w:p>
+            <w:r>
+              <w:rPr>
+                <w:sz w:val="18"/>
+              </w:rPr>
+              <w:t>0.32</w:t>
+            </w:r>
+          </w:p>
+        </w:tc>
+        <w:tc>
+          <w:tcPr>
+            <w:tcW w:type="dxa" w:w="3000"/>
+          </w:tcPr>
+          <w:p>
+            <w:r>
+              <w:rPr>
+                <w:sz w:val="18"/>
+              </w:rPr>
+              <w:t>1.00</w:t>
+            </w:r>
+          </w:p>
+        </w:tc>
+      </w:tr>
+      <w:tr>
+        <w:tc>
+          <w:tcPr>
+            <w:tcW w:type="dxa" w:w="4200"/>
+          </w:tcPr>
+          <w:p>
+            <w:r>
+              <w:rPr>
+                <w:sz w:val="18"/>
+              </w:rPr>
+              <w:t>D5 颜色</w:t>
+            </w:r>
+          </w:p>
+        </w:tc>
+        <w:tc>
+          <w:tcPr>
+            <w:tcW w:type="dxa" w:w="3000"/>
+          </w:tcPr>
+          <w:p>
+            <w:r>
+              <w:rPr>
+                <w:sz w:val="18"/>
+              </w:rPr>
+              <w:t>0.52</w:t>
+            </w:r>
+          </w:p>
+        </w:tc>
+        <w:tc>
+          <w:tcPr>
+            <w:tcW w:type="dxa" w:w="3000"/>
+          </w:tcPr>
+          <w:p>
+            <w:r>
+              <w:rPr>
+                <w:sz w:val="18"/>
+              </w:rPr>
+              <w:t>1.00</w:t>
+            </w:r>
+          </w:p>
+        </w:tc>
+      </w:tr>
+      <w:tr>
+        <w:tc>
+          <w:tcPr>
+            <w:tcW w:type="dxa" w:w="4200"/>
+          </w:tcPr>
+          <w:p>
+            <w:r>
+              <w:rPr>
+                <w:sz w:val="18"/>
+              </w:rPr>
+              <w:t>D6 记忆风险</w:t>
+            </w:r>
+          </w:p>
+        </w:tc>
+        <w:tc>
+          <w:tcPr>
+            <w:tcW w:type="dxa" w:w="3000"/>
+          </w:tcPr>
+          <w:p>
+            <w:r>
+              <w:rPr>
+                <w:sz w:val="18"/>
+              </w:rPr>
+              <w:t>0.73</w:t>
+            </w:r>
+          </w:p>
+        </w:tc>
+        <w:tc>
+          <w:tcPr>
+            <w:tcW w:type="dxa" w:w="3000"/>
+          </w:tcPr>
+          <w:p>
+            <w:r>
+              <w:rPr>
+                <w:sz w:val="18"/>
+              </w:rPr>
+              <w:t>0.00</w:t>
+            </w:r>
+          </w:p>
+        </w:tc>
+      </w:tr>
+      <w:tr>
+        <w:tc>
+          <w:tcPr>
+            <w:tcW w:type="dxa" w:w="4200"/>
+          </w:tcPr>
+          <w:p>
+            <w:r>
+              <w:rPr>
+                <w:sz w:val="18"/>
+              </w:rPr>
+              <w:t>总分(0-100)</w:t>
+            </w:r>
+          </w:p>
+        </w:tc>
+        <w:tc>
+          <w:tcPr>
+            <w:tcW w:type="dxa" w:w="3000"/>
+          </w:tcPr>
+          <w:p>
+            <w:r>
+              <w:rPr>
+                <w:sz w:val="18"/>
+              </w:rPr>
+              <w:t>45.2</w:t>
+            </w:r>
+          </w:p>
+        </w:tc>
+        <w:tc>
+          <w:tcPr>
+            <w:tcW w:type="dxa" w:w="3000"/>
+          </w:tcPr>
+          <w:p>
+            <w:r>
+              <w:rPr>
+                <w:sz w:val="18"/>
+              </w:rPr>
+              <w:t>80.8</w:t>
+            </w:r>
+          </w:p>
+        </w:tc>
+      </w:tr>
+    </w:tbl>
+    <w:p>
+      <w:pPr>
+        <w:jc w:val="center"/>
+      </w:pPr>
+      <w:r>
+        <w:drawing>
+          <wp:inline xmlns:a="http://schemas.openxmlformats.org/drawingml/2006/main" xmlns:pic="http://schemas.openxmlformats.org/drawingml/2006/picture">
+            <wp:extent cx="2011680" cy="2011680"/>
+            <wp:docPr id="5" name="Picture 5"/>
+            <wp:cNvGraphicFramePr>
+              <a:graphicFrameLocks noChangeAspect="1"/>
+            </wp:cNvGraphicFramePr>
+            <a:graphic>
+              <a:graphicData uri="http://schemas.openxmlformats.org/drawingml/2006/picture">
+                <pic:pic>
+                  <pic:nvPicPr>
+                    <pic:cNvPr id="0" name="sample_0000.png"/>
+                    <pic:cNvPicPr/>
+                  </pic:nvPicPr>
+                  <pic:blipFill>
+                    <a:blip r:embed="rId13"/>
+                    <a:stretch>
+                      <a:fillRect/>
+                    </a:stretch>
+                  </pic:blipFill>
+                  <pic:spPr>
+                    <a:xfrm>
+                      <a:off x="0" y="0"/>
+                      <a:ext cx="2011680" cy="2011680"/>
+                    </a:xfrm>
+                    <a:prstGeom prst="rect"/>
+                  </pic:spPr>
+                </pic:pic>
+              </a:graphicData>
+            </a:graphic>
+          </wp:inline>
+        </w:drawing>
+      </w:r>
+    </w:p>
+    <w:p>
+      <w:pPr>
+        <w:jc w:val="center"/>
+      </w:pPr>
+      <w:r>
+        <w:rPr>
+          <w:sz w:val="18"/>
+        </w:rPr>
+        <w:t>泊松病变重排示例 sample_0000（真实病灶被搬运重组，血管/布局继承宿主图）</w:t>
+      </w:r>
+    </w:p>
+    <w:p>
+      <w:pPr>
+        <w:pStyle w:val="Heading3"/>
+      </w:pPr>
+      <w:r>
+        <w:t>7.1.5 致命缺点</w:t>
+      </w:r>
+    </w:p>
+    <w:p>
+      <w:pPr>
+        <w:pStyle w:val="ListBullet"/>
+      </w:pPr>
+      <w:r>
+        <w:t>不生成新解剖结构：血管/视盘/病灶布局仍是宿主图的，只是换了位置/数量</w:t>
+      </w:r>
+    </w:p>
+    <w:p>
+      <w:pPr>
+        <w:pStyle w:val="ListBullet"/>
+      </w:pPr>
+      <w:r>
+        <w:t>高分部分源于底图复用：病灶/血管/颜色三维是真实像素的平凡胜利，如实标注</w:t>
+      </w:r>
+    </w:p>
+    <w:p>
+      <w:pPr>
+        <w:pStyle w:val="ListBullet"/>
+      </w:pPr>
+      <w:r>
+        <w:t>D6 记忆 0.00：最接近真实集，但也意味着离底图最近，需复制检测盯防（复制率 0.3% 已可控）</w:t>
+      </w:r>
+    </w:p>
+    <w:p>
+      <w:pPr>
+        <w:pStyle w:val="Heading3"/>
+      </w:pPr>
+      <w:r>
+        <w:t>7.1.6 下一步</w:t>
+      </w:r>
+    </w:p>
+    <w:p>
+      <w:r>
+        <w:t>泊松验证了"新病灶组合"假设成立：重排比纯拼接多一层语义（保留宿主图结构 + 搬运真实病灶）。它进入 Phase D 下游分类器验证候选——重点检验生成的重度图能否提升分类器对重度类的 Recall。</w:t>
       </w:r>
     </w:p>
     <w:p>
@@ -2673,12 +3166,15 @@
         <w:pStyle w:val="Heading2"/>
       </w:pPr>
       <w:r>
-        <w:t>7.2 Retinex 光照交换（文献基础：强）</w:t>
+        <w:t>7.2 Retinex 光照交换（EX-005，72.5 分）</w:t>
       </w:r>
     </w:p>
     <w:p>
+      <w:pPr>
+        <w:pStyle w:val="Heading3"/>
+      </w:pPr>
       <w:r>
-        <w:t>做法：每张图分解为光照 L × 反射 R，跨图交换 L、保留各自 R，重乘出新图。</w:t>
+        <w:t>7.2.1 是什么</w:t>
       </w:r>
     </w:p>
     <w:p>
@@ -2686,10 +3182,512 @@
         <w:rPr>
           <w:b/>
         </w:rPr>
-        <w:t>机制：</w:t>
+        <w:t>它：</w:t>
       </w:r>
       <w:r>
-        <w:t>为什么有用：反射 R 承载解剖结构（血管/视盘/病灶），光照 L 承载采集明暗色温。交换 L 只改"看起来的调子"，诊断语义几乎不变——安全的多样性放大器。（Zhang 2022 CBM：分割提升 9.6% Dice）</w:t>
+        <w:t>把每张图分解为光照 L × 反射 R（经典单尺度 Retinex，log 域高斯低通分解），跨图交换光照：新图 = R_A · L_A^(1-α) · L_B^α（α∈[0.6,0.9] 每张随机）。反射 R 承载解剖结构（血管/视盘/病灶），光照 L 承载采集明暗色温。交换 L 只改"看起来的调子"，诊断语义几乎不变。</w:t>
+      </w:r>
+    </w:p>
+    <w:p>
+      <w:pPr>
+        <w:pStyle w:val="Heading3"/>
+      </w:pPr>
+      <w:r>
+        <w:t>7.2.2 怎么做（略写）</w:t>
+      </w:r>
+    </w:p>
+    <w:p>
+      <w:pPr>
+        <w:ind w:left="432"/>
+      </w:pPr>
+      <w:r>
+        <w:rPr>
+          <w:rFonts w:ascii="Consolas" w:hAnsi="Consolas" w:eastAsia="微软雅黑"/>
+          <w:sz w:val="18"/>
+        </w:rPr>
+        <w:t>python scripts/retinex_gen.py --num_images 60 --seed 42 --kernel 41 --alpha_lo 0.6 --alpha_hi 0.9 --mem_ref ../../eval_data/real --mem_thr 0.85 --max_retry 20</w:t>
+      </w:r>
+    </w:p>
+    <w:p>
+      <w:pPr>
+        <w:ind w:left="432"/>
+      </w:pPr>
+      <w:r>
+        <w:rPr>
+          <w:rFonts w:ascii="Consolas" w:hAnsi="Consolas" w:eastAsia="微软雅黑"/>
+          <w:sz w:val="18"/>
+        </w:rPr>
+        <w:t># Retinex 分解 → 跨图光照 α 插值 → 重组 → 近复制过滤（NN-SSIM&gt;0.85 重采样，方案 3）</w:t>
+      </w:r>
+    </w:p>
+    <w:p>
+      <w:pPr>
+        <w:pStyle w:val="Heading3"/>
+      </w:pPr>
+      <w:r>
+        <w:t>7.2.3 为什么有用</w:t>
+      </w:r>
+    </w:p>
+    <w:p>
+      <w:r>
+        <w:t>反射 R 保留结构语义，光照 L 交换改变全局明暗/色温，两者解耦让"结构不变 + 风格变"成为可能——这是深度无条件生成器难以显式控制的光照维度。（Zhang 2022 CBM：分割提升 9.6% Dice）</w:t>
+      </w:r>
+    </w:p>
+    <w:p>
+      <w:pPr>
+        <w:pStyle w:val="Heading3"/>
+      </w:pPr>
+      <w:r>
+        <w:t>7.2.4 结果</w:t>
+      </w:r>
+    </w:p>
+    <w:p>
+      <w:r>
+        <w:t>总分 72.5，全场第 2。六维 D1 0.94 / D2 0.82 / D3 0.72 / D4 0.92 / D5 0.92 / D6 0.10。复制率 0%（方案 3 过滤后归零）。C2ST AUC 0.744——全场最佳，最难被识破｜ FID 117.9 / KID 0.056（全场最低，底图复用所致）｜ BRISQUE 3.70≈真实 3.69。病灶保留 出血 1.06/渗出 0.44（渗出偏低）。亮度中位 77（真实 61，部分图偏暗）。人眼评分【待人工评估】。</w:t>
+      </w:r>
+    </w:p>
+    <w:tbl>
+      <w:tblPr>
+        <w:tblStyle w:val="TableGrid"/>
+        <w:tblW w:type="auto" w:w="0"/>
+        <w:tblLayout w:type="fixed"/>
+        <w:tblLook w:firstColumn="1" w:firstRow="1" w:lastColumn="0" w:lastRow="0" w:noHBand="0" w:noVBand="1" w:val="04A0"/>
+        <w:tblW w:w="10200" w:type="dxa"/>
+        <w:tblLayout w:type="fixed"/>
+      </w:tblPr>
+      <w:tblGrid>
+        <w:gridCol w:w="4200"/>
+        <w:gridCol w:w="3000"/>
+        <w:gridCol w:w="3000"/>
+      </w:tblGrid>
+      <w:tr>
+        <w:tc>
+          <w:tcPr>
+            <w:tcW w:type="dxa" w:w="2880"/>
+            <w:tcW w:w="4200" w:type="dxa"/>
+          </w:tcPr>
+          <w:p>
+            <w:r>
+              <w:rPr>
+                <w:b/>
+                <w:sz w:val="18"/>
+              </w:rPr>
+              <w:t>评分维度</w:t>
+            </w:r>
+          </w:p>
+        </w:tc>
+        <w:tc>
+          <w:tcPr>
+            <w:tcW w:type="dxa" w:w="2880"/>
+            <w:tcW w:w="3000" w:type="dxa"/>
+          </w:tcPr>
+          <w:p>
+            <w:r>
+              <w:rPr>
+                <w:b/>
+                <w:sz w:val="18"/>
+              </w:rPr>
+              <w:t>FiLM+LPIPS(深度最佳)</w:t>
+            </w:r>
+          </w:p>
+        </w:tc>
+        <w:tc>
+          <w:tcPr>
+            <w:tcW w:type="dxa" w:w="2880"/>
+            <w:tcW w:w="3000" w:type="dxa"/>
+          </w:tcPr>
+          <w:p>
+            <w:r>
+              <w:rPr>
+                <w:b/>
+                <w:sz w:val="18"/>
+              </w:rPr>
+              <w:t>Retinex光照交换(EX-005)</w:t>
+            </w:r>
+          </w:p>
+        </w:tc>
+      </w:tr>
+      <w:tr>
+        <w:tc>
+          <w:tcPr>
+            <w:tcW w:type="dxa" w:w="4200"/>
+          </w:tcPr>
+          <w:p>
+            <w:r>
+              <w:rPr>
+                <w:sz w:val="18"/>
+              </w:rPr>
+              <w:t>D1 病灶保留</w:t>
+            </w:r>
+          </w:p>
+        </w:tc>
+        <w:tc>
+          <w:tcPr>
+            <w:tcW w:type="dxa" w:w="3000"/>
+          </w:tcPr>
+          <w:p>
+            <w:r>
+              <w:rPr>
+                <w:sz w:val="18"/>
+              </w:rPr>
+              <w:t>0.76</w:t>
+            </w:r>
+          </w:p>
+        </w:tc>
+        <w:tc>
+          <w:tcPr>
+            <w:tcW w:type="dxa" w:w="3000"/>
+          </w:tcPr>
+          <w:p>
+            <w:r>
+              <w:rPr>
+                <w:sz w:val="18"/>
+              </w:rPr>
+              <w:t>0.94</w:t>
+            </w:r>
+          </w:p>
+        </w:tc>
+      </w:tr>
+      <w:tr>
+        <w:tc>
+          <w:tcPr>
+            <w:tcW w:type="dxa" w:w="4200"/>
+          </w:tcPr>
+          <w:p>
+            <w:r>
+              <w:rPr>
+                <w:sz w:val="18"/>
+              </w:rPr>
+              <w:t>D2 抗识破+分布</w:t>
+            </w:r>
+          </w:p>
+        </w:tc>
+        <w:tc>
+          <w:tcPr>
+            <w:tcW w:type="dxa" w:w="3000"/>
+          </w:tcPr>
+          <w:p>
+            <w:r>
+              <w:rPr>
+                <w:sz w:val="18"/>
+              </w:rPr>
+              <w:t>0.45</w:t>
+            </w:r>
+          </w:p>
+        </w:tc>
+        <w:tc>
+          <w:tcPr>
+            <w:tcW w:type="dxa" w:w="3000"/>
+          </w:tcPr>
+          <w:p>
+            <w:r>
+              <w:rPr>
+                <w:sz w:val="18"/>
+              </w:rPr>
+              <w:t>0.82</w:t>
+            </w:r>
+          </w:p>
+        </w:tc>
+      </w:tr>
+      <w:tr>
+        <w:tc>
+          <w:tcPr>
+            <w:tcW w:type="dxa" w:w="4200"/>
+          </w:tcPr>
+          <w:p>
+            <w:r>
+              <w:rPr>
+                <w:sz w:val="18"/>
+              </w:rPr>
+              <w:t>D3 多样性/质量</w:t>
+            </w:r>
+          </w:p>
+        </w:tc>
+        <w:tc>
+          <w:tcPr>
+            <w:tcW w:type="dxa" w:w="3000"/>
+          </w:tcPr>
+          <w:p>
+            <w:r>
+              <w:rPr>
+                <w:sz w:val="18"/>
+              </w:rPr>
+              <w:t>0.76</w:t>
+            </w:r>
+          </w:p>
+        </w:tc>
+        <w:tc>
+          <w:tcPr>
+            <w:tcW w:type="dxa" w:w="3000"/>
+          </w:tcPr>
+          <w:p>
+            <w:r>
+              <w:rPr>
+                <w:sz w:val="18"/>
+              </w:rPr>
+              <w:t>0.72</w:t>
+            </w:r>
+          </w:p>
+        </w:tc>
+      </w:tr>
+      <w:tr>
+        <w:tc>
+          <w:tcPr>
+            <w:tcW w:type="dxa" w:w="4200"/>
+          </w:tcPr>
+          <w:p>
+            <w:r>
+              <w:rPr>
+                <w:sz w:val="18"/>
+              </w:rPr>
+              <w:t>D4 血管结构</w:t>
+            </w:r>
+          </w:p>
+        </w:tc>
+        <w:tc>
+          <w:tcPr>
+            <w:tcW w:type="dxa" w:w="3000"/>
+          </w:tcPr>
+          <w:p>
+            <w:r>
+              <w:rPr>
+                <w:sz w:val="18"/>
+              </w:rPr>
+              <w:t>0.32</w:t>
+            </w:r>
+          </w:p>
+        </w:tc>
+        <w:tc>
+          <w:tcPr>
+            <w:tcW w:type="dxa" w:w="3000"/>
+          </w:tcPr>
+          <w:p>
+            <w:r>
+              <w:rPr>
+                <w:sz w:val="18"/>
+              </w:rPr>
+              <w:t>0.92</w:t>
+            </w:r>
+          </w:p>
+        </w:tc>
+      </w:tr>
+      <w:tr>
+        <w:tc>
+          <w:tcPr>
+            <w:tcW w:type="dxa" w:w="4200"/>
+          </w:tcPr>
+          <w:p>
+            <w:r>
+              <w:rPr>
+                <w:sz w:val="18"/>
+              </w:rPr>
+              <w:t>D5 颜色</w:t>
+            </w:r>
+          </w:p>
+        </w:tc>
+        <w:tc>
+          <w:tcPr>
+            <w:tcW w:type="dxa" w:w="3000"/>
+          </w:tcPr>
+          <w:p>
+            <w:r>
+              <w:rPr>
+                <w:sz w:val="18"/>
+              </w:rPr>
+              <w:t>0.52</w:t>
+            </w:r>
+          </w:p>
+        </w:tc>
+        <w:tc>
+          <w:tcPr>
+            <w:tcW w:type="dxa" w:w="3000"/>
+          </w:tcPr>
+          <w:p>
+            <w:r>
+              <w:rPr>
+                <w:sz w:val="18"/>
+              </w:rPr>
+              <w:t>0.92</w:t>
+            </w:r>
+          </w:p>
+        </w:tc>
+      </w:tr>
+      <w:tr>
+        <w:tc>
+          <w:tcPr>
+            <w:tcW w:type="dxa" w:w="4200"/>
+          </w:tcPr>
+          <w:p>
+            <w:r>
+              <w:rPr>
+                <w:sz w:val="18"/>
+              </w:rPr>
+              <w:t>D6 记忆风险</w:t>
+            </w:r>
+          </w:p>
+        </w:tc>
+        <w:tc>
+          <w:tcPr>
+            <w:tcW w:type="dxa" w:w="3000"/>
+          </w:tcPr>
+          <w:p>
+            <w:r>
+              <w:rPr>
+                <w:sz w:val="18"/>
+              </w:rPr>
+              <w:t>0.73</w:t>
+            </w:r>
+          </w:p>
+        </w:tc>
+        <w:tc>
+          <w:tcPr>
+            <w:tcW w:type="dxa" w:w="3000"/>
+          </w:tcPr>
+          <w:p>
+            <w:r>
+              <w:rPr>
+                <w:sz w:val="18"/>
+              </w:rPr>
+              <w:t>0.10</w:t>
+            </w:r>
+          </w:p>
+        </w:tc>
+      </w:tr>
+      <w:tr>
+        <w:tc>
+          <w:tcPr>
+            <w:tcW w:type="dxa" w:w="4200"/>
+          </w:tcPr>
+          <w:p>
+            <w:r>
+              <w:rPr>
+                <w:sz w:val="18"/>
+              </w:rPr>
+              <w:t>总分(0-100)</w:t>
+            </w:r>
+          </w:p>
+        </w:tc>
+        <w:tc>
+          <w:tcPr>
+            <w:tcW w:type="dxa" w:w="3000"/>
+          </w:tcPr>
+          <w:p>
+            <w:r>
+              <w:rPr>
+                <w:sz w:val="18"/>
+              </w:rPr>
+              <w:t>45.2</w:t>
+            </w:r>
+          </w:p>
+        </w:tc>
+        <w:tc>
+          <w:tcPr>
+            <w:tcW w:type="dxa" w:w="3000"/>
+          </w:tcPr>
+          <w:p>
+            <w:r>
+              <w:rPr>
+                <w:sz w:val="18"/>
+              </w:rPr>
+              <w:t>72.5</w:t>
+            </w:r>
+          </w:p>
+        </w:tc>
+      </w:tr>
+    </w:tbl>
+    <w:p>
+      <w:pPr>
+        <w:jc w:val="center"/>
+      </w:pPr>
+      <w:r>
+        <w:drawing>
+          <wp:inline xmlns:a="http://schemas.openxmlformats.org/drawingml/2006/main" xmlns:pic="http://schemas.openxmlformats.org/drawingml/2006/picture">
+            <wp:extent cx="2011680" cy="2011680"/>
+            <wp:docPr id="6" name="Picture 6"/>
+            <wp:cNvGraphicFramePr>
+              <a:graphicFrameLocks noChangeAspect="1"/>
+            </wp:cNvGraphicFramePr>
+            <a:graphic>
+              <a:graphicData uri="http://schemas.openxmlformats.org/drawingml/2006/picture">
+                <pic:pic>
+                  <pic:nvPicPr>
+                    <pic:cNvPr id="0" name="sample_0000.png"/>
+                    <pic:cNvPicPr/>
+                  </pic:nvPicPr>
+                  <pic:blipFill>
+                    <a:blip r:embed="rId14"/>
+                    <a:stretch>
+                      <a:fillRect/>
+                    </a:stretch>
+                  </pic:blipFill>
+                  <pic:spPr>
+                    <a:xfrm>
+                      <a:off x="0" y="0"/>
+                      <a:ext cx="2011680" cy="2011680"/>
+                    </a:xfrm>
+                    <a:prstGeom prst="rect"/>
+                  </pic:spPr>
+                </pic:pic>
+              </a:graphicData>
+            </a:graphic>
+          </wp:inline>
+        </w:drawing>
+      </w:r>
+    </w:p>
+    <w:p>
+      <w:pPr>
+        <w:jc w:val="center"/>
+      </w:pPr>
+      <w:r>
+        <w:rPr>
+          <w:sz w:val="18"/>
+        </w:rPr>
+        <w:t>Retinex 光照交换示例 sample_0000（结构继承底图，光照来自供体图）</w:t>
+      </w:r>
+    </w:p>
+    <w:p>
+      <w:pPr>
+        <w:pStyle w:val="Heading3"/>
+      </w:pPr>
+      <w:r>
+        <w:t>7.2.5 致命缺点</w:t>
+      </w:r>
+    </w:p>
+    <w:p>
+      <w:pPr>
+        <w:pStyle w:val="ListBullet"/>
+      </w:pPr>
+      <w:r>
+        <w:t>不生成新病灶形态：结构完全继承底图，病灶组合/布局不变</w:t>
+      </w:r>
+    </w:p>
+    <w:p>
+      <w:pPr>
+        <w:pStyle w:val="ListBullet"/>
+      </w:pPr>
+      <w:r>
+        <w:t>平均 NN-SSIM 0.439 偏高 → D6 记忆 0.10 弱项（光照交换天然保留底图结构）</w:t>
+      </w:r>
+    </w:p>
+    <w:p>
+      <w:pPr>
+        <w:pStyle w:val="ListBullet"/>
+      </w:pPr>
+      <w:r>
+        <w:t>亮度受供体光照影响：部分图偏暗/偏亮</w:t>
+      </w:r>
+    </w:p>
+    <w:p>
+      <w:pPr>
+        <w:pStyle w:val="Heading3"/>
+      </w:pPr>
+      <w:r>
+        <w:t>7.2.6 下一步</w:t>
+      </w:r>
+    </w:p>
+    <w:p>
+      <w:r>
+        <w:t>Retinex 验证了"安全多样化"假设：抗识破全场最佳 + 复制归零，适合作为"相似但不相同"的多样性放大器。同样进入 Phase D 下游验证候选。</w:t>
       </w:r>
     </w:p>
     <w:p>
@@ -2697,7 +3695,7 @@
         <w:pStyle w:val="Heading2"/>
       </w:pPr>
       <w:r>
-        <w:t>7.3 可选：血管骨架 + 纹理拼布管线</w:t>
+        <w:t>7.3 可选：血管骨架 + 纹理拼布管线（后续方向）</w:t>
       </w:r>
     </w:p>
     <w:p>
@@ -2715,7 +3713,7 @@
     </w:p>
     <w:p>
       <w:r>
-        <w:t>深度无条件生成器难以显式控制"病灶种类/密度/位置"的组合；而泊松/Retinex 用显式规则做到。这正是本报告的核心论点：传统 ML 组合做深度方法做不到的事，作为数据扩充具有补充价值。</w:t>
+        <w:t>深度无条件生成器难以显式控制"病灶种类/密度/位置"与光照的组合；而泊松/Retinex 用显式规则做到——泊松造新病灶组合、Retinex 换光照风格。这正是本报告的核心论点：传统 ML 组合做深度方法做不到的事，作为数据扩充具有补充价值。</w:t>
       </w:r>
     </w:p>
     <w:p>
@@ -2736,7 +3734,57 @@
     </w:p>
     <w:p>
       <w:r>
-        <w:t>本报告用 330 张严重 DR 眼底彩照，系统试了三类传统 ML 方法（PCA 20.0 / GMM 40.2 / 补丁 42.1），与 Phase A/B 的 6 个深度方法在同一套评估体系下横向对比（深度最佳 FiLM+LPIPS 70.9）。</w:t>
+        <w:t>本报告用 330 张严重 DR 眼底彩照，系统试了三类传统 ML 基线（PCA 11.9 / GMM 22.6 / 补丁 31.0）与两条组合管线（泊松病变重排 80.8 / Retinex 光照交换 72.5），与 Phase A/B 的 6 个深度方法在同一套评估体系下横向对比（深度最佳 FiLM+LPIPS 当前 45.2）。⚠️ 综合评分是 min-max 相对分数，会随模型库扩大而平移，本报告各表使用同一版 _scores.json。</w:t>
+      </w:r>
+    </w:p>
+    <w:p>
+      <w:pPr>
+        <w:jc w:val="center"/>
+      </w:pPr>
+      <w:r>
+        <w:drawing>
+          <wp:inline xmlns:a="http://schemas.openxmlformats.org/drawingml/2006/main" xmlns:pic="http://schemas.openxmlformats.org/drawingml/2006/picture">
+            <wp:extent cx="5486400" cy="2804160"/>
+            <wp:docPr id="7" name="Picture 7"/>
+            <wp:cNvGraphicFramePr>
+              <a:graphicFrameLocks noChangeAspect="1"/>
+            </wp:cNvGraphicFramePr>
+            <a:graphic>
+              <a:graphicData uri="http://schemas.openxmlformats.org/drawingml/2006/picture">
+                <pic:pic>
+                  <pic:nvPicPr>
+                    <pic:cNvPr id="0" name="score_overview.png"/>
+                    <pic:cNvPicPr/>
+                  </pic:nvPicPr>
+                  <pic:blipFill>
+                    <a:blip r:embed="rId15"/>
+                    <a:stretch>
+                      <a:fillRect/>
+                    </a:stretch>
+                  </pic:blipFill>
+                  <pic:spPr>
+                    <a:xfrm>
+                      <a:off x="0" y="0"/>
+                      <a:ext cx="5486400" cy="2804160"/>
+                    </a:xfrm>
+                    <a:prstGeom prst="rect"/>
+                  </pic:spPr>
+                </pic:pic>
+              </a:graphicData>
+            </a:graphic>
+          </wp:inline>
+        </w:drawing>
+      </w:r>
+    </w:p>
+    <w:p>
+      <w:pPr>
+        <w:jc w:val="center"/>
+      </w:pPr>
+      <w:r>
+        <w:rPr>
+          <w:sz w:val="18"/>
+        </w:rPr>
+        <w:t>图 2：11 个模型综合评分总览（六维门控 0-100，min-max 相对分）</w:t>
       </w:r>
     </w:p>
     <w:p>
@@ -2752,7 +3800,7 @@
         <w:pStyle w:val="ListBullet"/>
       </w:pPr>
       <w:r>
-        <w:t>纯传统 ML 直接生成不可行：PCA/GMM 的过平滑证实"参数化方法必败于非高斯+强结构"；补丁虽得 42.1，但那是真实像素的平凡胜利，不是生成。</w:t>
+        <w:t>纯传统 ML 直接生成不可行：PCA/GMM 的过平滑证实"参数化方法必败于非高斯+强结构"；补丁虽得 31.0，但那是真实像素的平凡胜利，不是生成。</w:t>
       </w:r>
     </w:p>
     <w:p>
@@ -2760,7 +3808,7 @@
         <w:pStyle w:val="ListBullet"/>
       </w:pPr>
       <w:r>
-        <w:t>评分体系盲区被暴露：补丁伪高分（62.9→42.1）证明"用真实像素的方法必然在病灶/血管/颜色维度高分"，跨"真实重排 vs 生成"对比时 C2ST 必须跑。</w:t>
+        <w:t>评分体系盲区被暴露：补丁伪高分（62.9→补跑 C2ST 后大幅回落）证明"用真实像素的方法必然在病灶/血管/颜色维度高分"，跨"真实重排 vs 生成"对比时 C2ST 必须跑。</w:t>
       </w:r>
     </w:p>
     <w:p>
@@ -2769,6 +3817,14 @@
       </w:pPr>
       <w:r>
         <w:t>非参数保"相似"、参数化保不了：补丁法保纹理真实但缺结构，恰好引出组合管线。</w:t>
+      </w:r>
+    </w:p>
+    <w:p>
+      <w:pPr>
+        <w:pStyle w:val="ListBullet"/>
+      </w:pPr>
+      <w:r>
+        <w:t>组合管线让"相似但不相同"落地：泊松病变重排（80.8）与 Retinex 光照交换（72.5）都大幅超过三个基线，且复制率可控（0.3% / 0%）——泊松造新病灶组合、Retinex 换光照风格，做的是深度无条件生成器难以显式控制的事。</w:t>
       </w:r>
     </w:p>
     <w:p>
@@ -2826,7 +3882,7 @@
     </w:p>
     <w:p>
       <w:r>
-        <w:t>阶段 2 执行泊松病变重排 + Retinex 光照交换（各 300 张，同一套评估），验证"新病灶组合"假设；然后进入 Phase D 下游分类器验证（TSTR/TRTR 协议）。每步实验结果将按六段式更新到本报告。</w:t>
+        <w:t>阶段 2 已完成：泊松病变重排（80.8）验证"新病灶组合"、Retinex 光照交换（72.5）验证"安全多样化"假设均成立。下一步进入 Phase D 下游分类器验证（TSTR/TRTR 协议）：用生成的严重 DR 图扩充 DR 分级分类器训练集，验收"合成重度图显著提升对应类 Recall/F1/平衡准确率"。每步实验结果按六段式更新到本报告。</w:t>
       </w:r>
     </w:p>
     <w:p>

</xml_diff>